<commit_message>
Correct the JTF crosswalk validation claim, with a dated correction note
The published files said three independent reviewers rated all ten canonical
domains and "agreed on all ten, unanimously", and that the JTF rows were
"reviewed by SME consensus". The review record (hub v_review_effort) shows
124 s per mapping with a written rationale on 10 of 10 from one reviewer, and
12 s and 7 s per mapping with no rationale from the other two.

Replace it with the canonical wording from ops/scripts/public-claims.sh:
all ten canonical domain mappings were reviewed by a practicing site director
who recorded a written rationale for each, and confirmed by two further
reviewers. Each changed passage carries a dated note saying what it said
before. The Word crosswalk is replaced with the corrected copy sent to the
MRCT Center on 2026-09-28.

No competency, weight, threshold or mapping changed. No version bump.

Co-Authored-By: Claude Opus 5.5 <noreply@anthropic.com>
</commit_message>
<xml_diff>
--- a/crosswalks/CRLN-TRG-001-and-JTF-crosswalk.docx
+++ b/crosswalks/CRLN-TRG-001-and-JTF-crosswalk.docx
@@ -51,7 +51,7 @@
                 <w:b/>
                 <w:sz w:val="21"/>
               </w:rPr>
-              <w:t>Status: SME-validated at the canonical-domain level, 21 September 2026.</w:t>
+              <w:t>Status: reviewed at the canonical-domain level, 21 September 2026. Description of the review corrected 28 September 2026.</w:t>
             </w:r>
           </w:p>
           <w:p>
@@ -62,7 +62,7 @@
               <w:rPr>
                 <w:sz w:val="20"/>
               </w:rPr>
-              <w:t>Three independent reviewers rated all ten CRLN canonical domains against the JTF Core Competency Framework and ICH E6(R3) Annex 1, and agreed on all ten. Reviewers are named with their written consent in the published governance record.</w:t>
+              <w:t>All ten canonical domain mappings were reviewed by a practicing site director, who spent about two minutes on each and recorded a written rationale for every one, and confirmed by two further reviewers, who recorded agreement at about 7 and 12 seconds per mapping without a rationale. An earlier version of this document said three independent reviewers rated all ten and agreed on all ten. That was accurate as a count and misleading as a description of the review. No mapping has changed. Reviewers are named with their written consent in the published governance record.</w:t>
             </w:r>
           </w:p>
           <w:p>
@@ -713,7 +713,7 @@
           <w:color w:val="555555"/>
           <w:sz w:val="19"/>
         </w:rPr>
-        <w:t>All ten rows are recorded as validated, with no outstanding review, by subject-matter-expert consensus.</w:t>
+        <w:t>All ten rows are recorded as validated in CRLN's review register, on the review described in the status note above.</w:t>
       </w:r>
     </w:p>
     <w:p>
@@ -1112,7 +1112,7 @@
           <w:b/>
           <w:sz w:val="21"/>
         </w:rPr>
-        <w:t xml:space="preserve">That finer mapping is provisional and unreviewed, and is not covered by the validation above. </w:t>
+        <w:t xml:space="preserve">That finer mapping is provisional and unreviewed, and is not covered by the review above. </w:t>
       </w:r>
       <w:r>
         <w:rPr>

</xml_diff>

<commit_message>
Correct the JTF crosswalk validation claim, with a dated correction note (#14)
The published files said three independent reviewers rated all ten canonical
domains and "agreed on all ten, unanimously", and that the JTF rows were
"reviewed by SME consensus". The review record (hub v_review_effort) shows
124 s per mapping with a written rationale on 10 of 10 from one reviewer, and
12 s and 7 s per mapping with no rationale from the other two.

Replace it with the canonical wording from ops/scripts/public-claims.sh:
all ten canonical domain mappings were reviewed by a practicing site director
who recorded a written rationale for each, and confirmed by two further
reviewers. Each changed passage carries a dated note saying what it said
before. The Word crosswalk is replaced with the corrected copy sent to the
MRCT Center on 2026-09-28.

No competency, weight, threshold or mapping changed. No version bump.

Co-authored-by: Claude Opus 5.5 <noreply@anthropic.com>
</commit_message>
<xml_diff>
--- a/crosswalks/CRLN-TRG-001-and-JTF-crosswalk.docx
+++ b/crosswalks/CRLN-TRG-001-and-JTF-crosswalk.docx
@@ -51,7 +51,7 @@
                 <w:b/>
                 <w:sz w:val="21"/>
               </w:rPr>
-              <w:t>Status: SME-validated at the canonical-domain level, 21 September 2026.</w:t>
+              <w:t>Status: reviewed at the canonical-domain level, 21 September 2026. Description of the review corrected 28 September 2026.</w:t>
             </w:r>
           </w:p>
           <w:p>
@@ -62,7 +62,7 @@
               <w:rPr>
                 <w:sz w:val="20"/>
               </w:rPr>
-              <w:t>Three independent reviewers rated all ten CRLN canonical domains against the JTF Core Competency Framework and ICH E6(R3) Annex 1, and agreed on all ten. Reviewers are named with their written consent in the published governance record.</w:t>
+              <w:t>All ten canonical domain mappings were reviewed by a practicing site director, who spent about two minutes on each and recorded a written rationale for every one, and confirmed by two further reviewers, who recorded agreement at about 7 and 12 seconds per mapping without a rationale. An earlier version of this document said three independent reviewers rated all ten and agreed on all ten. That was accurate as a count and misleading as a description of the review. No mapping has changed. Reviewers are named with their written consent in the published governance record.</w:t>
             </w:r>
           </w:p>
           <w:p>
@@ -713,7 +713,7 @@
           <w:color w:val="555555"/>
           <w:sz w:val="19"/>
         </w:rPr>
-        <w:t>All ten rows are recorded as validated, with no outstanding review, by subject-matter-expert consensus.</w:t>
+        <w:t>All ten rows are recorded as validated in CRLN's review register, on the review described in the status note above.</w:t>
       </w:r>
     </w:p>
     <w:p>
@@ -1112,7 +1112,7 @@
           <w:b/>
           <w:sz w:val="21"/>
         </w:rPr>
-        <w:t xml:space="preserve">That finer mapping is provisional and unreviewed, and is not covered by the validation above. </w:t>
+        <w:t xml:space="preserve">That finer mapping is provisional and unreviewed, and is not covered by the review above. </w:t>
       </w:r>
       <w:r>
         <w:rPr>

</xml_diff>